<commit_message>
Files updated, figures stored [24Nov2025]
</commit_message>
<xml_diff>
--- a/contents/tables/reproduced/table7_reproduced.docx
+++ b/contents/tables/reproduced/table7_reproduced.docx
@@ -22,12 +22,6 @@
         <w:gridCol w:w="1350"/>
       </w:tblGrid>
       <w:tr>
-        <w:tblPrEx>
-          <w:tblCellMar>
-            <w:top w:w="0" w:type="dxa"/>
-            <w:bottom w:w="0" w:type="dxa"/>
-          </w:tblCellMar>
-        </w:tblPrEx>
         <w:trPr>
           <w:trHeight w:val="615"/>
         </w:trPr>
@@ -43,7 +37,7 @@
           </w:tcPr>
           <w:p>
             <w:pPr>
-              <w:spacing w:after="0"/>
+              <w:spacing w:after="0" w:line="240" w:lineRule="auto"/>
               <w:rPr>
                 <w:rFonts w:ascii="CMU Serif" w:hAnsi="CMU Serif" w:cs="CMU Serif"/>
                 <w:b/>
@@ -78,7 +72,7 @@
           </w:tcPr>
           <w:p>
             <w:pPr>
-              <w:spacing w:after="0"/>
+              <w:spacing w:after="0" w:line="240" w:lineRule="auto"/>
               <w:rPr>
                 <w:rFonts w:ascii="CMU Serif" w:hAnsi="CMU Serif" w:cs="CMU Serif"/>
                 <w:b/>
@@ -115,7 +109,7 @@
           </w:tcPr>
           <w:p>
             <w:pPr>
-              <w:spacing w:after="0"/>
+              <w:spacing w:after="0" w:line="240" w:lineRule="auto"/>
               <w:rPr>
                 <w:rFonts w:ascii="CMU Serif" w:hAnsi="CMU Serif" w:cs="CMU Serif"/>
                 <w:b/>
@@ -152,7 +146,7 @@
           </w:tcPr>
           <w:p>
             <w:pPr>
-              <w:spacing w:after="0"/>
+              <w:spacing w:after="0" w:line="240" w:lineRule="auto"/>
               <w:rPr>
                 <w:rFonts w:ascii="CMU Serif" w:hAnsi="CMU Serif" w:cs="CMU Serif"/>
                 <w:b/>
@@ -187,7 +181,7 @@
           </w:tcPr>
           <w:p>
             <w:pPr>
-              <w:spacing w:after="0"/>
+              <w:spacing w:after="0" w:line="240" w:lineRule="auto"/>
               <w:rPr>
                 <w:rFonts w:ascii="CMU Serif" w:hAnsi="CMU Serif" w:cs="CMU Serif"/>
                 <w:b/>
@@ -224,7 +218,7 @@
           </w:tcPr>
           <w:p>
             <w:pPr>
-              <w:spacing w:after="0"/>
+              <w:spacing w:after="0" w:line="240" w:lineRule="auto"/>
               <w:rPr>
                 <w:rFonts w:ascii="CMU Serif" w:hAnsi="CMU Serif" w:cs="CMU Serif"/>
                 <w:b/>
@@ -249,12 +243,6 @@
         </w:tc>
       </w:tr>
       <w:tr>
-        <w:tblPrEx>
-          <w:tblCellMar>
-            <w:top w:w="0" w:type="dxa"/>
-            <w:bottom w:w="0" w:type="dxa"/>
-          </w:tblCellMar>
-        </w:tblPrEx>
         <w:trPr>
           <w:trHeight w:val="297"/>
         </w:trPr>
@@ -270,7 +258,7 @@
           </w:tcPr>
           <w:p>
             <w:pPr>
-              <w:spacing w:before="60" w:after="120"/>
+              <w:spacing w:after="0" w:line="240" w:lineRule="auto"/>
               <w:rPr>
                 <w:rFonts w:ascii="CMU Serif" w:hAnsi="CMU Serif" w:cs="CMU Serif"/>
                 <w:sz w:val="20"/>
@@ -299,7 +287,7 @@
           </w:tcPr>
           <w:p>
             <w:pPr>
-              <w:spacing w:before="60" w:after="120"/>
+              <w:spacing w:after="0" w:line="240" w:lineRule="auto"/>
               <w:rPr>
                 <w:rFonts w:ascii="CMU Serif" w:hAnsi="CMU Serif" w:cs="CMU Serif"/>
                 <w:sz w:val="20"/>
@@ -328,7 +316,7 @@
           </w:tcPr>
           <w:p>
             <w:pPr>
-              <w:spacing w:before="60" w:after="120"/>
+              <w:spacing w:after="0" w:line="240" w:lineRule="auto"/>
               <w:rPr>
                 <w:rFonts w:ascii="CMU Serif" w:hAnsi="CMU Serif" w:cs="CMU Serif"/>
                 <w:sz w:val="20"/>
@@ -357,7 +345,7 @@
           </w:tcPr>
           <w:p>
             <w:pPr>
-              <w:spacing w:before="60" w:after="120"/>
+              <w:spacing w:after="0" w:line="240" w:lineRule="auto"/>
               <w:rPr>
                 <w:rFonts w:ascii="CMU Serif" w:hAnsi="CMU Serif" w:cs="CMU Serif"/>
                 <w:sz w:val="20"/>
@@ -386,7 +374,7 @@
           </w:tcPr>
           <w:p>
             <w:pPr>
-              <w:spacing w:before="60" w:after="120"/>
+              <w:spacing w:after="0" w:line="240" w:lineRule="auto"/>
               <w:rPr>
                 <w:rFonts w:ascii="CMU Serif" w:hAnsi="CMU Serif" w:cs="CMU Serif"/>
                 <w:sz w:val="20"/>
@@ -415,7 +403,7 @@
           </w:tcPr>
           <w:p>
             <w:pPr>
-              <w:spacing w:before="60" w:after="120"/>
+              <w:spacing w:after="0" w:line="240" w:lineRule="auto"/>
               <w:rPr>
                 <w:rFonts w:ascii="CMU Serif" w:hAnsi="CMU Serif" w:cs="CMU Serif"/>
                 <w:sz w:val="20"/>
@@ -434,12 +422,6 @@
         </w:tc>
       </w:tr>
       <w:tr>
-        <w:tblPrEx>
-          <w:tblCellMar>
-            <w:top w:w="0" w:type="dxa"/>
-            <w:bottom w:w="0" w:type="dxa"/>
-          </w:tblCellMar>
-        </w:tblPrEx>
         <w:trPr>
           <w:trHeight w:val="297"/>
         </w:trPr>
@@ -455,7 +437,7 @@
           </w:tcPr>
           <w:p>
             <w:pPr>
-              <w:spacing w:before="60" w:after="120"/>
+              <w:spacing w:after="0" w:line="240" w:lineRule="auto"/>
               <w:rPr>
                 <w:rFonts w:ascii="CMU Serif" w:hAnsi="CMU Serif" w:cs="CMU Serif"/>
                 <w:sz w:val="20"/>
@@ -484,7 +466,7 @@
           </w:tcPr>
           <w:p>
             <w:pPr>
-              <w:spacing w:before="60" w:after="120"/>
+              <w:spacing w:after="0" w:line="240" w:lineRule="auto"/>
               <w:rPr>
                 <w:rFonts w:ascii="CMU Serif" w:hAnsi="CMU Serif" w:cs="CMU Serif"/>
                 <w:sz w:val="20"/>
@@ -513,7 +495,7 @@
           </w:tcPr>
           <w:p>
             <w:pPr>
-              <w:spacing w:before="60" w:after="120"/>
+              <w:spacing w:after="0" w:line="240" w:lineRule="auto"/>
               <w:rPr>
                 <w:rFonts w:ascii="CMU Serif" w:hAnsi="CMU Serif" w:cs="CMU Serif"/>
                 <w:sz w:val="20"/>
@@ -542,7 +524,7 @@
           </w:tcPr>
           <w:p>
             <w:pPr>
-              <w:spacing w:before="60" w:after="120"/>
+              <w:spacing w:after="0" w:line="240" w:lineRule="auto"/>
               <w:rPr>
                 <w:rFonts w:ascii="CMU Serif" w:hAnsi="CMU Serif" w:cs="CMU Serif"/>
                 <w:sz w:val="20"/>
@@ -571,7 +553,7 @@
           </w:tcPr>
           <w:p>
             <w:pPr>
-              <w:spacing w:before="60" w:after="120"/>
+              <w:spacing w:after="0" w:line="240" w:lineRule="auto"/>
               <w:rPr>
                 <w:rFonts w:ascii="CMU Serif" w:hAnsi="CMU Serif" w:cs="CMU Serif"/>
                 <w:sz w:val="20"/>
@@ -600,7 +582,7 @@
           </w:tcPr>
           <w:p>
             <w:pPr>
-              <w:spacing w:before="60" w:after="120"/>
+              <w:spacing w:after="0" w:line="240" w:lineRule="auto"/>
               <w:rPr>
                 <w:rFonts w:ascii="CMU Serif" w:hAnsi="CMU Serif" w:cs="CMU Serif"/>
                 <w:sz w:val="20"/>
@@ -619,12 +601,6 @@
         </w:tc>
       </w:tr>
       <w:tr>
-        <w:tblPrEx>
-          <w:tblCellMar>
-            <w:top w:w="0" w:type="dxa"/>
-            <w:bottom w:w="0" w:type="dxa"/>
-          </w:tblCellMar>
-        </w:tblPrEx>
         <w:trPr>
           <w:trHeight w:val="297"/>
         </w:trPr>
@@ -640,7 +616,7 @@
           </w:tcPr>
           <w:p>
             <w:pPr>
-              <w:spacing w:before="60" w:after="120"/>
+              <w:spacing w:after="0" w:line="240" w:lineRule="auto"/>
               <w:rPr>
                 <w:rFonts w:ascii="CMU Serif" w:hAnsi="CMU Serif" w:cs="CMU Serif"/>
                 <w:sz w:val="20"/>
@@ -669,7 +645,7 @@
           </w:tcPr>
           <w:p>
             <w:pPr>
-              <w:spacing w:before="60" w:after="120"/>
+              <w:spacing w:after="0" w:line="240" w:lineRule="auto"/>
               <w:rPr>
                 <w:rFonts w:ascii="CMU Serif" w:hAnsi="CMU Serif" w:cs="CMU Serif"/>
                 <w:sz w:val="20"/>
@@ -698,7 +674,7 @@
           </w:tcPr>
           <w:p>
             <w:pPr>
-              <w:spacing w:before="60" w:after="120"/>
+              <w:spacing w:after="0" w:line="240" w:lineRule="auto"/>
               <w:rPr>
                 <w:rFonts w:ascii="CMU Serif" w:hAnsi="CMU Serif" w:cs="CMU Serif"/>
                 <w:sz w:val="20"/>
@@ -727,7 +703,7 @@
           </w:tcPr>
           <w:p>
             <w:pPr>
-              <w:spacing w:before="60" w:after="120"/>
+              <w:spacing w:after="0" w:line="240" w:lineRule="auto"/>
               <w:rPr>
                 <w:rFonts w:ascii="CMU Serif" w:hAnsi="CMU Serif" w:cs="CMU Serif"/>
                 <w:sz w:val="20"/>
@@ -756,7 +732,7 @@
           </w:tcPr>
           <w:p>
             <w:pPr>
-              <w:spacing w:before="60" w:after="120"/>
+              <w:spacing w:after="0" w:line="240" w:lineRule="auto"/>
               <w:rPr>
                 <w:rFonts w:ascii="CMU Serif" w:hAnsi="CMU Serif" w:cs="CMU Serif"/>
                 <w:sz w:val="20"/>
@@ -785,7 +761,7 @@
           </w:tcPr>
           <w:p>
             <w:pPr>
-              <w:spacing w:before="60" w:after="120"/>
+              <w:spacing w:after="0" w:line="240" w:lineRule="auto"/>
               <w:rPr>
                 <w:rFonts w:ascii="CMU Serif" w:hAnsi="CMU Serif" w:cs="CMU Serif"/>
                 <w:sz w:val="20"/>
@@ -804,12 +780,6 @@
         </w:tc>
       </w:tr>
       <w:tr>
-        <w:tblPrEx>
-          <w:tblCellMar>
-            <w:top w:w="0" w:type="dxa"/>
-            <w:bottom w:w="0" w:type="dxa"/>
-          </w:tblCellMar>
-        </w:tblPrEx>
         <w:trPr>
           <w:trHeight w:val="297"/>
         </w:trPr>
@@ -825,7 +795,7 @@
           </w:tcPr>
           <w:p>
             <w:pPr>
-              <w:spacing w:before="60" w:after="120"/>
+              <w:spacing w:after="0" w:line="240" w:lineRule="auto"/>
               <w:rPr>
                 <w:rFonts w:ascii="CMU Serif" w:hAnsi="CMU Serif" w:cs="CMU Serif"/>
                 <w:sz w:val="20"/>
@@ -856,7 +826,7 @@
           </w:tcPr>
           <w:p>
             <w:pPr>
-              <w:spacing w:before="60" w:after="120"/>
+              <w:spacing w:after="0" w:line="240" w:lineRule="auto"/>
               <w:rPr>
                 <w:rFonts w:ascii="CMU Serif" w:hAnsi="CMU Serif" w:cs="CMU Serif"/>
                 <w:sz w:val="20"/>
@@ -885,7 +855,7 @@
           </w:tcPr>
           <w:p>
             <w:pPr>
-              <w:spacing w:before="60" w:after="120"/>
+              <w:spacing w:after="0" w:line="240" w:lineRule="auto"/>
               <w:rPr>
                 <w:rFonts w:ascii="CMU Serif" w:hAnsi="CMU Serif" w:cs="CMU Serif"/>
                 <w:sz w:val="20"/>
@@ -914,7 +884,7 @@
           </w:tcPr>
           <w:p>
             <w:pPr>
-              <w:spacing w:before="60" w:after="120"/>
+              <w:spacing w:after="0" w:line="240" w:lineRule="auto"/>
               <w:rPr>
                 <w:rFonts w:ascii="CMU Serif" w:hAnsi="CMU Serif" w:cs="CMU Serif"/>
                 <w:sz w:val="20"/>
@@ -943,7 +913,7 @@
           </w:tcPr>
           <w:p>
             <w:pPr>
-              <w:spacing w:before="60" w:after="120"/>
+              <w:spacing w:after="0" w:line="240" w:lineRule="auto"/>
               <w:rPr>
                 <w:rFonts w:ascii="CMU Serif" w:hAnsi="CMU Serif" w:cs="CMU Serif"/>
                 <w:sz w:val="20"/>
@@ -972,7 +942,7 @@
           </w:tcPr>
           <w:p>
             <w:pPr>
-              <w:spacing w:before="60" w:after="120"/>
+              <w:spacing w:after="0" w:line="240" w:lineRule="auto"/>
               <w:rPr>
                 <w:rFonts w:ascii="CMU Serif" w:hAnsi="CMU Serif" w:cs="CMU Serif"/>
                 <w:sz w:val="20"/>
@@ -991,12 +961,6 @@
         </w:tc>
       </w:tr>
       <w:tr>
-        <w:tblPrEx>
-          <w:tblCellMar>
-            <w:top w:w="0" w:type="dxa"/>
-            <w:bottom w:w="0" w:type="dxa"/>
-          </w:tblCellMar>
-        </w:tblPrEx>
         <w:trPr>
           <w:trHeight w:val="297"/>
         </w:trPr>
@@ -1012,7 +976,7 @@
           </w:tcPr>
           <w:p>
             <w:pPr>
-              <w:spacing w:before="60" w:after="120"/>
+              <w:spacing w:after="0" w:line="240" w:lineRule="auto"/>
               <w:rPr>
                 <w:rFonts w:ascii="CMU Serif" w:hAnsi="CMU Serif" w:cs="CMU Serif"/>
                 <w:sz w:val="20"/>
@@ -1043,7 +1007,7 @@
           </w:tcPr>
           <w:p>
             <w:pPr>
-              <w:spacing w:before="60" w:after="120"/>
+              <w:spacing w:after="0" w:line="240" w:lineRule="auto"/>
               <w:rPr>
                 <w:rFonts w:ascii="CMU Serif" w:hAnsi="CMU Serif" w:cs="CMU Serif"/>
                 <w:sz w:val="20"/>
@@ -1072,7 +1036,7 @@
           </w:tcPr>
           <w:p>
             <w:pPr>
-              <w:spacing w:before="60" w:after="120"/>
+              <w:spacing w:after="0" w:line="240" w:lineRule="auto"/>
               <w:rPr>
                 <w:rFonts w:ascii="CMU Serif" w:hAnsi="CMU Serif" w:cs="CMU Serif"/>
                 <w:sz w:val="20"/>
@@ -1101,7 +1065,7 @@
           </w:tcPr>
           <w:p>
             <w:pPr>
-              <w:spacing w:before="60" w:after="120"/>
+              <w:spacing w:after="0" w:line="240" w:lineRule="auto"/>
               <w:rPr>
                 <w:rFonts w:ascii="CMU Serif" w:hAnsi="CMU Serif" w:cs="CMU Serif"/>
                 <w:sz w:val="20"/>
@@ -1130,7 +1094,7 @@
           </w:tcPr>
           <w:p>
             <w:pPr>
-              <w:spacing w:before="60" w:after="120"/>
+              <w:spacing w:after="0" w:line="240" w:lineRule="auto"/>
               <w:rPr>
                 <w:rFonts w:ascii="CMU Serif" w:hAnsi="CMU Serif" w:cs="CMU Serif"/>
                 <w:sz w:val="20"/>
@@ -1159,7 +1123,7 @@
           </w:tcPr>
           <w:p>
             <w:pPr>
-              <w:spacing w:before="60" w:after="120"/>
+              <w:spacing w:after="0" w:line="240" w:lineRule="auto"/>
               <w:rPr>
                 <w:rFonts w:ascii="CMU Serif" w:hAnsi="CMU Serif" w:cs="CMU Serif"/>
                 <w:sz w:val="20"/>
@@ -1178,12 +1142,6 @@
         </w:tc>
       </w:tr>
       <w:tr>
-        <w:tblPrEx>
-          <w:tblCellMar>
-            <w:top w:w="0" w:type="dxa"/>
-            <w:bottom w:w="0" w:type="dxa"/>
-          </w:tblCellMar>
-        </w:tblPrEx>
         <w:trPr>
           <w:trHeight w:val="297"/>
         </w:trPr>
@@ -1199,7 +1157,7 @@
           </w:tcPr>
           <w:p>
             <w:pPr>
-              <w:spacing w:before="60" w:after="120"/>
+              <w:spacing w:after="0" w:line="240" w:lineRule="auto"/>
               <w:rPr>
                 <w:rFonts w:ascii="CMU Serif" w:hAnsi="CMU Serif" w:cs="CMU Serif"/>
                 <w:sz w:val="20"/>
@@ -1230,7 +1188,7 @@
           </w:tcPr>
           <w:p>
             <w:pPr>
-              <w:spacing w:before="60" w:after="120"/>
+              <w:spacing w:after="0" w:line="240" w:lineRule="auto"/>
               <w:rPr>
                 <w:rFonts w:ascii="CMU Serif" w:hAnsi="CMU Serif" w:cs="CMU Serif"/>
                 <w:sz w:val="20"/>
@@ -1259,7 +1217,7 @@
           </w:tcPr>
           <w:p>
             <w:pPr>
-              <w:spacing w:before="60" w:after="120"/>
+              <w:spacing w:after="0" w:line="240" w:lineRule="auto"/>
               <w:rPr>
                 <w:rFonts w:ascii="CMU Serif" w:hAnsi="CMU Serif" w:cs="CMU Serif"/>
                 <w:sz w:val="20"/>
@@ -1288,7 +1246,7 @@
           </w:tcPr>
           <w:p>
             <w:pPr>
-              <w:spacing w:before="60" w:after="120"/>
+              <w:spacing w:after="0" w:line="240" w:lineRule="auto"/>
               <w:rPr>
                 <w:rFonts w:ascii="CMU Serif" w:hAnsi="CMU Serif" w:cs="CMU Serif"/>
                 <w:sz w:val="20"/>
@@ -1317,7 +1275,7 @@
           </w:tcPr>
           <w:p>
             <w:pPr>
-              <w:spacing w:before="60" w:after="120"/>
+              <w:spacing w:after="0" w:line="240" w:lineRule="auto"/>
               <w:rPr>
                 <w:rFonts w:ascii="CMU Serif" w:hAnsi="CMU Serif" w:cs="CMU Serif"/>
                 <w:sz w:val="20"/>
@@ -1346,7 +1304,7 @@
           </w:tcPr>
           <w:p>
             <w:pPr>
-              <w:spacing w:before="60" w:after="120"/>
+              <w:spacing w:after="0" w:line="240" w:lineRule="auto"/>
               <w:rPr>
                 <w:rFonts w:ascii="CMU Serif" w:hAnsi="CMU Serif" w:cs="CMU Serif"/>
                 <w:sz w:val="20"/>
@@ -1365,12 +1323,6 @@
         </w:tc>
       </w:tr>
       <w:tr>
-        <w:tblPrEx>
-          <w:tblCellMar>
-            <w:top w:w="0" w:type="dxa"/>
-            <w:bottom w:w="0" w:type="dxa"/>
-          </w:tblCellMar>
-        </w:tblPrEx>
         <w:trPr>
           <w:trHeight w:val="297"/>
         </w:trPr>
@@ -1386,7 +1338,7 @@
           </w:tcPr>
           <w:p>
             <w:pPr>
-              <w:spacing w:before="60" w:after="120"/>
+              <w:spacing w:after="0" w:line="240" w:lineRule="auto"/>
               <w:rPr>
                 <w:rFonts w:ascii="CMU Serif" w:hAnsi="CMU Serif" w:cs="CMU Serif"/>
                 <w:sz w:val="20"/>
@@ -1417,7 +1369,7 @@
           </w:tcPr>
           <w:p>
             <w:pPr>
-              <w:spacing w:before="60" w:after="120"/>
+              <w:spacing w:after="0" w:line="240" w:lineRule="auto"/>
               <w:rPr>
                 <w:rFonts w:ascii="CMU Serif" w:hAnsi="CMU Serif" w:cs="CMU Serif"/>
                 <w:sz w:val="20"/>
@@ -1446,7 +1398,7 @@
           </w:tcPr>
           <w:p>
             <w:pPr>
-              <w:spacing w:before="60" w:after="120"/>
+              <w:spacing w:after="0" w:line="240" w:lineRule="auto"/>
               <w:rPr>
                 <w:rFonts w:ascii="CMU Serif" w:hAnsi="CMU Serif" w:cs="CMU Serif"/>
                 <w:sz w:val="20"/>
@@ -1475,7 +1427,7 @@
           </w:tcPr>
           <w:p>
             <w:pPr>
-              <w:spacing w:before="60" w:after="120"/>
+              <w:spacing w:after="0" w:line="240" w:lineRule="auto"/>
               <w:rPr>
                 <w:rFonts w:ascii="CMU Serif" w:hAnsi="CMU Serif" w:cs="CMU Serif"/>
                 <w:sz w:val="20"/>
@@ -1504,7 +1456,7 @@
           </w:tcPr>
           <w:p>
             <w:pPr>
-              <w:spacing w:before="60" w:after="120"/>
+              <w:spacing w:after="0" w:line="240" w:lineRule="auto"/>
               <w:rPr>
                 <w:rFonts w:ascii="CMU Serif" w:hAnsi="CMU Serif" w:cs="CMU Serif"/>
                 <w:sz w:val="20"/>
@@ -1533,7 +1485,7 @@
           </w:tcPr>
           <w:p>
             <w:pPr>
-              <w:spacing w:before="60" w:after="120"/>
+              <w:spacing w:after="0" w:line="240" w:lineRule="auto"/>
               <w:rPr>
                 <w:rFonts w:ascii="CMU Serif" w:hAnsi="CMU Serif" w:cs="CMU Serif"/>
                 <w:sz w:val="20"/>
@@ -1552,12 +1504,6 @@
         </w:tc>
       </w:tr>
       <w:tr>
-        <w:tblPrEx>
-          <w:tblCellMar>
-            <w:top w:w="0" w:type="dxa"/>
-            <w:bottom w:w="0" w:type="dxa"/>
-          </w:tblCellMar>
-        </w:tblPrEx>
         <w:trPr>
           <w:trHeight w:val="297"/>
         </w:trPr>
@@ -1573,7 +1519,7 @@
           </w:tcPr>
           <w:p>
             <w:pPr>
-              <w:spacing w:before="60" w:after="120"/>
+              <w:spacing w:after="0" w:line="240" w:lineRule="auto"/>
               <w:rPr>
                 <w:rFonts w:ascii="CMU Serif" w:hAnsi="CMU Serif" w:cs="CMU Serif"/>
                 <w:sz w:val="20"/>
@@ -1604,7 +1550,7 @@
           </w:tcPr>
           <w:p>
             <w:pPr>
-              <w:spacing w:before="60" w:after="120"/>
+              <w:spacing w:after="0" w:line="240" w:lineRule="auto"/>
               <w:rPr>
                 <w:rFonts w:ascii="CMU Serif" w:hAnsi="CMU Serif" w:cs="CMU Serif"/>
                 <w:sz w:val="20"/>
@@ -1633,7 +1579,7 @@
           </w:tcPr>
           <w:p>
             <w:pPr>
-              <w:spacing w:before="60" w:after="120"/>
+              <w:spacing w:after="0" w:line="240" w:lineRule="auto"/>
               <w:rPr>
                 <w:rFonts w:ascii="CMU Serif" w:hAnsi="CMU Serif" w:cs="CMU Serif"/>
                 <w:sz w:val="20"/>
@@ -1662,7 +1608,7 @@
           </w:tcPr>
           <w:p>
             <w:pPr>
-              <w:spacing w:before="60" w:after="120"/>
+              <w:spacing w:after="0" w:line="240" w:lineRule="auto"/>
               <w:rPr>
                 <w:rFonts w:ascii="CMU Serif" w:hAnsi="CMU Serif" w:cs="CMU Serif"/>
                 <w:sz w:val="20"/>
@@ -1691,7 +1637,7 @@
           </w:tcPr>
           <w:p>
             <w:pPr>
-              <w:spacing w:before="60" w:after="120"/>
+              <w:spacing w:after="0" w:line="240" w:lineRule="auto"/>
               <w:rPr>
                 <w:rFonts w:ascii="CMU Serif" w:hAnsi="CMU Serif" w:cs="CMU Serif"/>
                 <w:sz w:val="20"/>
@@ -1720,7 +1666,7 @@
           </w:tcPr>
           <w:p>
             <w:pPr>
-              <w:spacing w:before="60" w:after="120"/>
+              <w:spacing w:after="0" w:line="240" w:lineRule="auto"/>
               <w:rPr>
                 <w:rFonts w:ascii="CMU Serif" w:hAnsi="CMU Serif" w:cs="CMU Serif"/>
                 <w:sz w:val="20"/>
@@ -1739,12 +1685,6 @@
         </w:tc>
       </w:tr>
       <w:tr>
-        <w:tblPrEx>
-          <w:tblCellMar>
-            <w:top w:w="0" w:type="dxa"/>
-            <w:bottom w:w="0" w:type="dxa"/>
-          </w:tblCellMar>
-        </w:tblPrEx>
         <w:trPr>
           <w:trHeight w:val="297"/>
         </w:trPr>
@@ -1760,7 +1700,7 @@
           </w:tcPr>
           <w:p>
             <w:pPr>
-              <w:spacing w:before="60" w:after="120"/>
+              <w:spacing w:after="0" w:line="240" w:lineRule="auto"/>
               <w:rPr>
                 <w:rFonts w:ascii="CMU Serif" w:hAnsi="CMU Serif" w:cs="CMU Serif"/>
                 <w:sz w:val="20"/>
@@ -1791,7 +1731,7 @@
           </w:tcPr>
           <w:p>
             <w:pPr>
-              <w:spacing w:before="60" w:after="120"/>
+              <w:spacing w:after="0" w:line="240" w:lineRule="auto"/>
               <w:rPr>
                 <w:rFonts w:ascii="CMU Serif" w:hAnsi="CMU Serif" w:cs="CMU Serif"/>
                 <w:sz w:val="20"/>
@@ -1820,7 +1760,7 @@
           </w:tcPr>
           <w:p>
             <w:pPr>
-              <w:spacing w:before="60" w:after="120"/>
+              <w:spacing w:after="0" w:line="240" w:lineRule="auto"/>
               <w:rPr>
                 <w:rFonts w:ascii="CMU Serif" w:hAnsi="CMU Serif" w:cs="CMU Serif"/>
                 <w:sz w:val="20"/>
@@ -1849,7 +1789,7 @@
           </w:tcPr>
           <w:p>
             <w:pPr>
-              <w:spacing w:before="60" w:after="120"/>
+              <w:spacing w:after="0" w:line="240" w:lineRule="auto"/>
               <w:rPr>
                 <w:rFonts w:ascii="CMU Serif" w:hAnsi="CMU Serif" w:cs="CMU Serif"/>
                 <w:sz w:val="20"/>
@@ -1878,7 +1818,7 @@
           </w:tcPr>
           <w:p>
             <w:pPr>
-              <w:spacing w:before="60" w:after="120"/>
+              <w:spacing w:after="0" w:line="240" w:lineRule="auto"/>
               <w:rPr>
                 <w:rFonts w:ascii="CMU Serif" w:hAnsi="CMU Serif" w:cs="CMU Serif"/>
                 <w:sz w:val="20"/>
@@ -1907,7 +1847,7 @@
           </w:tcPr>
           <w:p>
             <w:pPr>
-              <w:spacing w:before="60" w:after="120"/>
+              <w:spacing w:after="0" w:line="240" w:lineRule="auto"/>
               <w:rPr>
                 <w:rFonts w:ascii="CMU Serif" w:hAnsi="CMU Serif" w:cs="CMU Serif"/>
                 <w:sz w:val="20"/>
@@ -1926,12 +1866,6 @@
         </w:tc>
       </w:tr>
       <w:tr>
-        <w:tblPrEx>
-          <w:tblCellMar>
-            <w:top w:w="0" w:type="dxa"/>
-            <w:bottom w:w="0" w:type="dxa"/>
-          </w:tblCellMar>
-        </w:tblPrEx>
         <w:trPr>
           <w:trHeight w:val="297"/>
         </w:trPr>
@@ -1947,7 +1881,7 @@
           </w:tcPr>
           <w:p>
             <w:pPr>
-              <w:spacing w:before="60" w:after="120"/>
+              <w:spacing w:after="0" w:line="240" w:lineRule="auto"/>
               <w:rPr>
                 <w:rFonts w:ascii="CMU Serif" w:hAnsi="CMU Serif" w:cs="CMU Serif"/>
                 <w:sz w:val="20"/>
@@ -1978,7 +1912,7 @@
           </w:tcPr>
           <w:p>
             <w:pPr>
-              <w:spacing w:before="60" w:after="120"/>
+              <w:spacing w:after="0" w:line="240" w:lineRule="auto"/>
               <w:rPr>
                 <w:rFonts w:ascii="CMU Serif" w:hAnsi="CMU Serif" w:cs="CMU Serif"/>
                 <w:sz w:val="20"/>
@@ -2007,7 +1941,7 @@
           </w:tcPr>
           <w:p>
             <w:pPr>
-              <w:spacing w:before="60" w:after="120"/>
+              <w:spacing w:after="0" w:line="240" w:lineRule="auto"/>
               <w:rPr>
                 <w:rFonts w:ascii="CMU Serif" w:hAnsi="CMU Serif" w:cs="CMU Serif"/>
                 <w:sz w:val="20"/>
@@ -2036,7 +1970,7 @@
           </w:tcPr>
           <w:p>
             <w:pPr>
-              <w:spacing w:before="60" w:after="120"/>
+              <w:spacing w:after="0" w:line="240" w:lineRule="auto"/>
               <w:rPr>
                 <w:rFonts w:ascii="CMU Serif" w:hAnsi="CMU Serif" w:cs="CMU Serif"/>
                 <w:sz w:val="20"/>
@@ -2065,7 +1999,7 @@
           </w:tcPr>
           <w:p>
             <w:pPr>
-              <w:spacing w:before="60" w:after="120"/>
+              <w:spacing w:after="0" w:line="240" w:lineRule="auto"/>
               <w:rPr>
                 <w:rFonts w:ascii="CMU Serif" w:hAnsi="CMU Serif" w:cs="CMU Serif"/>
                 <w:sz w:val="20"/>
@@ -2094,7 +2028,7 @@
           </w:tcPr>
           <w:p>
             <w:pPr>
-              <w:spacing w:before="60" w:after="120"/>
+              <w:spacing w:after="0" w:line="240" w:lineRule="auto"/>
               <w:rPr>
                 <w:rFonts w:ascii="CMU Serif" w:hAnsi="CMU Serif" w:cs="CMU Serif"/>
                 <w:sz w:val="20"/>
@@ -2113,12 +2047,6 @@
         </w:tc>
       </w:tr>
       <w:tr>
-        <w:tblPrEx>
-          <w:tblCellMar>
-            <w:top w:w="0" w:type="dxa"/>
-            <w:bottom w:w="0" w:type="dxa"/>
-          </w:tblCellMar>
-        </w:tblPrEx>
         <w:trPr>
           <w:trHeight w:val="297"/>
         </w:trPr>
@@ -2134,7 +2062,7 @@
           </w:tcPr>
           <w:p>
             <w:pPr>
-              <w:spacing w:before="60" w:after="120"/>
+              <w:spacing w:after="0" w:line="240" w:lineRule="auto"/>
               <w:rPr>
                 <w:rFonts w:ascii="CMU Serif" w:hAnsi="CMU Serif" w:cs="CMU Serif"/>
                 <w:sz w:val="20"/>
@@ -2163,7 +2091,7 @@
           </w:tcPr>
           <w:p>
             <w:pPr>
-              <w:spacing w:before="60" w:after="120"/>
+              <w:spacing w:after="0" w:line="240" w:lineRule="auto"/>
               <w:rPr>
                 <w:rFonts w:ascii="CMU Serif" w:hAnsi="CMU Serif" w:cs="CMU Serif"/>
                 <w:sz w:val="20"/>
@@ -2192,7 +2120,7 @@
           </w:tcPr>
           <w:p>
             <w:pPr>
-              <w:spacing w:before="60" w:after="120"/>
+              <w:spacing w:after="0" w:line="240" w:lineRule="auto"/>
               <w:rPr>
                 <w:rFonts w:ascii="CMU Serif" w:hAnsi="CMU Serif" w:cs="CMU Serif"/>
                 <w:sz w:val="20"/>
@@ -2221,7 +2149,7 @@
           </w:tcPr>
           <w:p>
             <w:pPr>
-              <w:spacing w:before="60" w:after="120"/>
+              <w:spacing w:after="0" w:line="240" w:lineRule="auto"/>
               <w:rPr>
                 <w:rFonts w:ascii="CMU Serif" w:hAnsi="CMU Serif" w:cs="CMU Serif"/>
                 <w:sz w:val="20"/>
@@ -2250,7 +2178,7 @@
           </w:tcPr>
           <w:p>
             <w:pPr>
-              <w:spacing w:before="60" w:after="120"/>
+              <w:spacing w:after="0" w:line="240" w:lineRule="auto"/>
               <w:rPr>
                 <w:rFonts w:ascii="CMU Serif" w:hAnsi="CMU Serif" w:cs="CMU Serif"/>
                 <w:sz w:val="20"/>
@@ -2279,7 +2207,7 @@
           </w:tcPr>
           <w:p>
             <w:pPr>
-              <w:spacing w:before="60" w:after="120"/>
+              <w:spacing w:after="0" w:line="240" w:lineRule="auto"/>
               <w:rPr>
                 <w:rFonts w:ascii="CMU Serif" w:hAnsi="CMU Serif" w:cs="CMU Serif"/>
                 <w:sz w:val="20"/>
@@ -2298,12 +2226,6 @@
         </w:tc>
       </w:tr>
       <w:tr>
-        <w:tblPrEx>
-          <w:tblCellMar>
-            <w:top w:w="0" w:type="dxa"/>
-            <w:bottom w:w="0" w:type="dxa"/>
-          </w:tblCellMar>
-        </w:tblPrEx>
         <w:trPr>
           <w:trHeight w:val="297"/>
         </w:trPr>
@@ -2319,7 +2241,7 @@
           </w:tcPr>
           <w:p>
             <w:pPr>
-              <w:spacing w:before="60" w:after="120"/>
+              <w:spacing w:after="0" w:line="240" w:lineRule="auto"/>
               <w:rPr>
                 <w:rFonts w:ascii="CMU Serif" w:hAnsi="CMU Serif" w:cs="CMU Serif"/>
                 <w:sz w:val="20"/>
@@ -2348,7 +2270,7 @@
           </w:tcPr>
           <w:p>
             <w:pPr>
-              <w:spacing w:before="60" w:after="120"/>
+              <w:spacing w:after="0" w:line="240" w:lineRule="auto"/>
               <w:rPr>
                 <w:rFonts w:ascii="CMU Serif" w:hAnsi="CMU Serif" w:cs="CMU Serif"/>
                 <w:sz w:val="20"/>
@@ -2377,7 +2299,7 @@
           </w:tcPr>
           <w:p>
             <w:pPr>
-              <w:spacing w:before="60" w:after="120"/>
+              <w:spacing w:after="0" w:line="240" w:lineRule="auto"/>
               <w:rPr>
                 <w:rFonts w:ascii="CMU Serif" w:hAnsi="CMU Serif" w:cs="CMU Serif"/>
                 <w:sz w:val="20"/>
@@ -2406,7 +2328,7 @@
           </w:tcPr>
           <w:p>
             <w:pPr>
-              <w:spacing w:before="60" w:after="120"/>
+              <w:spacing w:after="0" w:line="240" w:lineRule="auto"/>
               <w:rPr>
                 <w:rFonts w:ascii="CMU Serif" w:hAnsi="CMU Serif" w:cs="CMU Serif"/>
                 <w:sz w:val="20"/>
@@ -2435,7 +2357,7 @@
           </w:tcPr>
           <w:p>
             <w:pPr>
-              <w:spacing w:before="60" w:after="120"/>
+              <w:spacing w:after="0" w:line="240" w:lineRule="auto"/>
               <w:rPr>
                 <w:rFonts w:ascii="CMU Serif" w:hAnsi="CMU Serif" w:cs="CMU Serif"/>
                 <w:sz w:val="20"/>
@@ -2464,7 +2386,7 @@
           </w:tcPr>
           <w:p>
             <w:pPr>
-              <w:spacing w:before="60" w:after="120"/>
+              <w:spacing w:after="0" w:line="240" w:lineRule="auto"/>
               <w:rPr>
                 <w:rFonts w:ascii="CMU Serif" w:hAnsi="CMU Serif" w:cs="CMU Serif"/>
                 <w:sz w:val="20"/>
@@ -2483,12 +2405,6 @@
         </w:tc>
       </w:tr>
       <w:tr>
-        <w:tblPrEx>
-          <w:tblCellMar>
-            <w:top w:w="0" w:type="dxa"/>
-            <w:bottom w:w="0" w:type="dxa"/>
-          </w:tblCellMar>
-        </w:tblPrEx>
         <w:trPr>
           <w:trHeight w:val="297"/>
         </w:trPr>
@@ -2504,7 +2420,7 @@
           </w:tcPr>
           <w:p>
             <w:pPr>
-              <w:spacing w:before="60" w:after="120"/>
+              <w:spacing w:after="0" w:line="240" w:lineRule="auto"/>
               <w:rPr>
                 <w:rFonts w:ascii="CMU Serif" w:hAnsi="CMU Serif" w:cs="CMU Serif"/>
                 <w:sz w:val="20"/>
@@ -2535,7 +2451,7 @@
           </w:tcPr>
           <w:p>
             <w:pPr>
-              <w:spacing w:before="60" w:after="120"/>
+              <w:spacing w:after="0" w:line="240" w:lineRule="auto"/>
               <w:rPr>
                 <w:rFonts w:ascii="CMU Serif" w:hAnsi="CMU Serif" w:cs="CMU Serif"/>
                 <w:sz w:val="20"/>
@@ -2564,7 +2480,7 @@
           </w:tcPr>
           <w:p>
             <w:pPr>
-              <w:spacing w:before="60" w:after="120"/>
+              <w:spacing w:after="0" w:line="240" w:lineRule="auto"/>
               <w:rPr>
                 <w:rFonts w:ascii="CMU Serif" w:hAnsi="CMU Serif" w:cs="CMU Serif"/>
                 <w:sz w:val="20"/>
@@ -2593,7 +2509,7 @@
           </w:tcPr>
           <w:p>
             <w:pPr>
-              <w:spacing w:before="60" w:after="120"/>
+              <w:spacing w:after="0" w:line="240" w:lineRule="auto"/>
               <w:rPr>
                 <w:rFonts w:ascii="CMU Serif" w:hAnsi="CMU Serif" w:cs="CMU Serif"/>
                 <w:sz w:val="20"/>
@@ -2622,7 +2538,7 @@
           </w:tcPr>
           <w:p>
             <w:pPr>
-              <w:spacing w:before="60" w:after="120"/>
+              <w:spacing w:after="0" w:line="240" w:lineRule="auto"/>
               <w:rPr>
                 <w:rFonts w:ascii="CMU Serif" w:hAnsi="CMU Serif" w:cs="CMU Serif"/>
                 <w:sz w:val="20"/>
@@ -2651,7 +2567,7 @@
           </w:tcPr>
           <w:p>
             <w:pPr>
-              <w:spacing w:before="60" w:after="120"/>
+              <w:spacing w:after="0" w:line="240" w:lineRule="auto"/>
               <w:rPr>
                 <w:rFonts w:ascii="CMU Serif" w:hAnsi="CMU Serif" w:cs="CMU Serif"/>
                 <w:sz w:val="20"/>
@@ -3305,6 +3221,7 @@
   <w:style w:type="character" w:default="1" w:styleId="DefaultParagraphFont">
     <w:name w:val="Default Paragraph Font"/>
     <w:uiPriority w:val="1"/>
+    <w:semiHidden/>
     <w:unhideWhenUsed/>
   </w:style>
   <w:style w:type="table" w:default="1" w:styleId="TableNormal">

</xml_diff>